<commit_message>
JSL: caixas recebidas/expedidas, pedidos faturados e bags (Barry)
- IN Caixas Recebidas (Barry, PMB, Mondelez, Nestlé) e OUT Caixas
  Expedidas e Pedidos Faturados (todos, inclusive GM), lidos de
  QUANT_CAIXAS e QUANT_PEDIDOS.
- Barry: IN Bags Recebidos e OUT Bags Expedidos (QUANT_BAGS).
- BD, Config (colunas da BD e cards), Dashboard, Monitoramento e Consol
  Mensal atualizados; metas por cliente aceitam os novos indicadores.
- Modelos vazios e manual da JSL atualizados.

Co-Authored-By: Claude Opus 5.5 <noreply@anthropic.com>
Claude-Session: https://claude.ai/code/session_018R75zNjSBiJnTTDUgbhCDy
</commit_message>
<xml_diff>
--- a/Manual_Planilha_JSL.docx
+++ b/Manual_Planilha_JSL.docx
@@ -1259,7 +1259,7 @@
       <w:r>
         <w:drawing>
           <wp:inline distT="0" distB="0" distL="0" distR="0">
-            <wp:extent cx="5715000" cy="2181225"/>
+            <wp:extent cx="5715000" cy="2219325"/>
             <wp:effectExtent t="0" r="0" b="0" l="0"/>
             <wp:docPr id="1" name="" descr="" title=""/>
             <wp:cNvGraphicFramePr>
@@ -1284,7 +1284,7 @@
                   <pic:spPr bwMode="auto">
                     <a:xfrm>
                       <a:off x="0" y="0"/>
-                      <a:ext cx="5715000" cy="2181225"/>
+                      <a:ext cx="5715000" cy="2219325"/>
                     </a:xfrm>
                     <a:prstGeom prst="rect">
                       <a:avLst/>
@@ -2133,7 +2133,7 @@
       <w:r>
         <w:drawing>
           <wp:inline distT="0" distB="0" distL="0" distR="0">
-            <wp:extent cx="4953000" cy="1933575"/>
+            <wp:extent cx="4953000" cy="2019300"/>
             <wp:effectExtent t="0" r="0" b="0" l="0"/>
             <wp:docPr id="1" name="" descr="" title=""/>
             <wp:cNvGraphicFramePr>
@@ -2158,7 +2158,7 @@
                   <pic:spPr bwMode="auto">
                     <a:xfrm>
                       <a:off x="0" y="0"/>
-                      <a:ext cx="4953000" cy="1933575"/>
+                      <a:ext cx="4953000" cy="2019300"/>
                     </a:xfrm>
                     <a:prstGeom prst="rect">
                       <a:avLst/>
@@ -2453,7 +2453,7 @@
       <w:r>
         <w:drawing>
           <wp:inline distT="0" distB="0" distL="0" distR="0">
-            <wp:extent cx="5715000" cy="2152650"/>
+            <wp:extent cx="5715000" cy="2514600"/>
             <wp:effectExtent t="0" r="0" b="0" l="0"/>
             <wp:docPr id="1" name="" descr="" title=""/>
             <wp:cNvGraphicFramePr>
@@ -2478,7 +2478,7 @@
                   <pic:spPr bwMode="auto">
                     <a:xfrm>
                       <a:off x="0" y="0"/>
-                      <a:ext cx="5715000" cy="2152650"/>
+                      <a:ext cx="5715000" cy="2514600"/>
                     </a:xfrm>
                     <a:prstGeom prst="rect">
                       <a:avLst/>
@@ -2584,7 +2584,7 @@
       <w:r>
         <w:drawing>
           <wp:inline distT="0" distB="0" distL="0" distR="0">
-            <wp:extent cx="5334000" cy="3228975"/>
+            <wp:extent cx="5334000" cy="3600450"/>
             <wp:effectExtent t="0" r="0" b="0" l="0"/>
             <wp:docPr id="1" name="" descr="" title=""/>
             <wp:cNvGraphicFramePr>
@@ -2609,7 +2609,7 @@
                   <pic:spPr bwMode="auto">
                     <a:xfrm>
                       <a:off x="0" y="0"/>
-                      <a:ext cx="5334000" cy="3228975"/>
+                      <a:ext cx="5334000" cy="3600450"/>
                     </a:xfrm>
                     <a:prstGeom prst="rect">
                       <a:avLst/>
@@ -3237,7 +3237,7 @@
         <w:rPr>
           <w:rFonts w:ascii="Calibri" w:cs="Calibri" w:eastAsia="Calibri" w:hAnsi="Calibri"/>
         </w:rPr>
-        <w:t xml:space="preserve">A vaga nova já vem com o padrão (padrão JSL (veículos, pallets e toneladas IN/OUT + NC, Ocupação e Gente)). Ajuste apenas o que for diferente.</w:t>
+        <w:t xml:space="preserve">A vaga nova já vem com o padrão (padrão JSL (veículos, pallets, toneladas e caixas IN/OUT, pedidos faturados + NC, Ocupação e Gente; bags só se marcar)). Ajuste apenas o que for diferente.</w:t>
       </w:r>
     </w:p>
     <w:p>
@@ -3452,7 +3452,7 @@
         <w:rPr>
           <w:rFonts w:ascii="Calibri" w:cs="Calibri" w:eastAsia="Calibri" w:hAnsi="Calibri"/>
         </w:rPr>
-        <w:t xml:space="preserve"> (vagas para novos clientes). Cada bloco já traz as 20 linhas de indicadores da planilha.</w:t>
+        <w:t xml:space="preserve"> (vagas para novos clientes). Cada bloco já traz as 25 linhas de indicadores da planilha.</w:t>
       </w:r>
     </w:p>
     <w:p>
@@ -6310,7 +6310,7 @@
               <w:rPr>
                 <w:rFonts w:ascii="Calibri" w:cs="Calibri" w:eastAsia="Calibri" w:hAnsi="Calibri"/>
               </w:rPr>
-              <w:t xml:space="preserve">Veículos, Pallets, Toneladas</w:t>
+              <w:t xml:space="preserve">Veículos, Pallets, Toneladas, Caixas Recebidas, Bags Recebidos</w:t>
             </w:r>
           </w:p>
         </w:tc>
@@ -6333,7 +6333,7 @@
               <w:rPr>
                 <w:rFonts w:ascii="Calibri" w:cs="Calibri" w:eastAsia="Calibri" w:hAnsi="Calibri"/>
               </w:rPr>
-              <w:t xml:space="preserve">Veículos, Pallets, Toneladas</w:t>
+              <w:t xml:space="preserve">Veículos, Pallets, Toneladas, Caixas Expedidas, Pedidos Faturados, Bags Expedidos</w:t>
             </w:r>
           </w:p>
         </w:tc>
@@ -6430,7 +6430,7 @@
               <w:rPr>
                 <w:rFonts w:ascii="Calibri" w:cs="Calibri" w:eastAsia="Calibri" w:hAnsi="Calibri"/>
               </w:rPr>
-              <w:t xml:space="preserve">Veículos, Pallets, Toneladas</w:t>
+              <w:t xml:space="preserve">Veículos, Pallets, Toneladas, Caixas Expedidas, Pedidos Faturados</w:t>
             </w:r>
           </w:p>
         </w:tc>
@@ -6504,7 +6504,7 @@
               <w:rPr>
                 <w:rFonts w:ascii="Calibri" w:cs="Calibri" w:eastAsia="Calibri" w:hAnsi="Calibri"/>
               </w:rPr>
-              <w:t xml:space="preserve">Veículos, Pallets, Toneladas</w:t>
+              <w:t xml:space="preserve">Veículos, Pallets, Toneladas, Caixas Recebidas</w:t>
             </w:r>
           </w:p>
         </w:tc>
@@ -6527,7 +6527,7 @@
               <w:rPr>
                 <w:rFonts w:ascii="Calibri" w:cs="Calibri" w:eastAsia="Calibri" w:hAnsi="Calibri"/>
               </w:rPr>
-              <w:t xml:space="preserve">Veículos, Pallets, Toneladas</w:t>
+              <w:t xml:space="preserve">Veículos, Pallets, Toneladas, Caixas Expedidas, Pedidos Faturados</w:t>
             </w:r>
           </w:p>
         </w:tc>
@@ -6601,7 +6601,7 @@
               <w:rPr>
                 <w:rFonts w:ascii="Calibri" w:cs="Calibri" w:eastAsia="Calibri" w:hAnsi="Calibri"/>
               </w:rPr>
-              <w:t xml:space="preserve">Veículos, Pallets, Toneladas</w:t>
+              <w:t xml:space="preserve">Veículos, Pallets, Toneladas, Caixas Recebidas</w:t>
             </w:r>
           </w:p>
         </w:tc>
@@ -6624,7 +6624,7 @@
               <w:rPr>
                 <w:rFonts w:ascii="Calibri" w:cs="Calibri" w:eastAsia="Calibri" w:hAnsi="Calibri"/>
               </w:rPr>
-              <w:t xml:space="preserve">Veículos, Pallets, Toneladas</w:t>
+              <w:t xml:space="preserve">Veículos, Pallets, Toneladas, Caixas Expedidas, Pedidos Faturados</w:t>
             </w:r>
           </w:p>
         </w:tc>
@@ -6698,7 +6698,7 @@
               <w:rPr>
                 <w:rFonts w:ascii="Calibri" w:cs="Calibri" w:eastAsia="Calibri" w:hAnsi="Calibri"/>
               </w:rPr>
-              <w:t xml:space="preserve">Veículos, Pallets, Toneladas</w:t>
+              <w:t xml:space="preserve">Veículos, Pallets, Toneladas, Caixas Recebidas</w:t>
             </w:r>
           </w:p>
         </w:tc>
@@ -6721,7 +6721,7 @@
               <w:rPr>
                 <w:rFonts w:ascii="Calibri" w:cs="Calibri" w:eastAsia="Calibri" w:hAnsi="Calibri"/>
               </w:rPr>
-              <w:t xml:space="preserve">Veículos, Pallets, Toneladas</w:t>
+              <w:t xml:space="preserve">Veículos, Pallets, Toneladas, Caixas Expedidas, Pedidos Faturados</w:t>
             </w:r>
           </w:p>
         </w:tc>

</xml_diff>

<commit_message>
Modalidade e posições contratadas na Config; card de ocupação mostra Cross/Spot; metas em tabela
- Config (tabela 1): colunas MODALIDADE (Contrato/Spot/Cross) e POSIÇÕES
  CONTRATADAS por cliente; na BD, Modalidade e Posições Disponíveis viram
  colunas automáticas (cinza, não digitáveis) puxadas da Config.
- Dashboard: cliente Spot/Cross entra sozinho em "Só ocupadas" e o card
  mostra CONTRATO · CROSS/SPOT e as posições ocupadas.
- BD: tabela de METAS DO MÊS formatada como tabela (título, cabeçalho, grade).
- Modelos vazios e manuais JSL/TPC atualizados.

Co-Authored-By: Claude Opus 5.5 <noreply@anthropic.com>
Claude-Session: https://claude.ai/code/session_018R75zNjSBiJnTTDUgbhCDy
</commit_message>
<xml_diff>
--- a/Manual_Planilha_JSL.docx
+++ b/Manual_Planilha_JSL.docx
@@ -1259,7 +1259,7 @@
       <w:r>
         <w:drawing>
           <wp:inline distT="0" distB="0" distL="0" distR="0">
-            <wp:extent cx="5715000" cy="2219325"/>
+            <wp:extent cx="5715000" cy="2257425"/>
             <wp:effectExtent t="0" r="0" b="0" l="0"/>
             <wp:docPr id="1" name="" descr="" title=""/>
             <wp:cNvGraphicFramePr>
@@ -1284,7 +1284,7 @@
                   <pic:spPr bwMode="auto">
                     <a:xfrm>
                       <a:off x="0" y="0"/>
-                      <a:ext cx="5715000" cy="2219325"/>
+                      <a:ext cx="5715000" cy="2257425"/>
                     </a:xfrm>
                     <a:prstGeom prst="rect">
                       <a:avLst/>
@@ -1443,7 +1443,21 @@
         <w:rPr>
           <w:rFonts w:ascii="Calibri" w:cs="Calibri" w:eastAsia="Calibri" w:hAnsi="Calibri"/>
         </w:rPr>
-        <w:t xml:space="preserve"> (Contrato, Spot ou Cross): escolha na lista quando se aplicar.</w:t>
+        <w:t xml:space="preserve"> e </w:t>
+      </w:r>
+      <w:r>
+        <w:rPr>
+          <w:rFonts w:ascii="Calibri" w:cs="Calibri" w:eastAsia="Calibri" w:hAnsi="Calibri"/>
+          <w:b/>
+          <w:bCs/>
+        </w:rPr>
+        <w:t xml:space="preserve">Posições Disponíveis</w:t>
+      </w:r>
+      <w:r>
+        <w:rPr>
+          <w:rFonts w:ascii="Calibri" w:cs="Calibri" w:eastAsia="Calibri" w:hAnsi="Calibri"/>
+        </w:rPr>
+        <w:t xml:space="preserve"> (colunas cinza) são automáticas: vêm do cadastro do cliente na Config. Não digite nelas.</w:t>
       </w:r>
     </w:p>
     <w:p>
@@ -1832,7 +1846,7 @@
               <w:rPr>
                 <w:rFonts w:ascii="Calibri" w:cs="Calibri" w:eastAsia="Calibri" w:hAnsi="Calibri"/>
               </w:rPr>
-              <w:t xml:space="preserve">Posições Ocupadas em </w:t>
+              <w:t xml:space="preserve">Modalidade e Posições Disponíveis </w:t>
             </w:r>
             <w:r>
               <w:rPr>
@@ -1840,7 +1854,7 @@
                 <w:b/>
                 <w:bCs/>
               </w:rPr>
-              <w:t xml:space="preserve">verde</w:t>
+              <w:t xml:space="preserve">cinza claro</w:t>
             </w:r>
           </w:p>
         </w:tc>
@@ -1863,7 +1877,7 @@
               <w:rPr>
                 <w:rFonts w:ascii="Calibri" w:cs="Calibri" w:eastAsia="Calibri" w:hAnsi="Calibri"/>
               </w:rPr>
-              <w:t xml:space="preserve">O cliente ocupou mais que o contratado (excedente a faturar).</w:t>
+              <w:t xml:space="preserve">Colunas automáticas: vêm da Config (MODALIDADE e POSIÇÕES CONTRATADAS do cliente).</w:t>
             </w:r>
           </w:p>
         </w:tc>
@@ -1886,7 +1900,7 @@
               <w:rPr>
                 <w:rFonts w:ascii="Calibri" w:cs="Calibri" w:eastAsia="Calibri" w:hAnsi="Calibri"/>
               </w:rPr>
-              <w:t xml:space="preserve">Informativo.</w:t>
+              <w:t xml:space="preserve">Para mudar, ajuste a Config (capítulo 6).</w:t>
             </w:r>
           </w:p>
         </w:tc>
@@ -1914,7 +1928,15 @@
               <w:rPr>
                 <w:rFonts w:ascii="Calibri" w:cs="Calibri" w:eastAsia="Calibri" w:hAnsi="Calibri"/>
               </w:rPr>
-              <w:t xml:space="preserve">Mensagem "não se aplica / valor inválido"</w:t>
+              <w:t xml:space="preserve">Posições Ocupadas em </w:t>
+            </w:r>
+            <w:r>
+              <w:rPr>
+                <w:rFonts w:ascii="Calibri" w:cs="Calibri" w:eastAsia="Calibri" w:hAnsi="Calibri"/>
+                <w:b/>
+                <w:bCs/>
+              </w:rPr>
+              <w:t xml:space="preserve">verde</w:t>
             </w:r>
           </w:p>
         </w:tc>
@@ -1937,7 +1959,7 @@
               <w:rPr>
                 <w:rFonts w:ascii="Calibri" w:cs="Calibri" w:eastAsia="Calibri" w:hAnsi="Calibri"/>
               </w:rPr>
-              <w:t xml:space="preserve">Tentou digitar numa coluna bloqueada para o cliente ou um número negativo.</w:t>
+              <w:t xml:space="preserve">O cliente ocupou mais que o contratado (excedente a faturar).</w:t>
             </w:r>
           </w:p>
         </w:tc>
@@ -1945,6 +1967,80 @@
           <w:tcPr>
             <w:tcW w:type="dxa" w:w="3000"/>
             <w:shd w:fill="FFFFFF" w:color="auto" w:val="clear"/>
+            <w:tcMar>
+              <w:top w:type="dxa" w:w="60"/>
+              <w:left w:type="dxa" w:w="100"/>
+              <w:bottom w:type="dxa" w:w="60"/>
+              <w:right w:type="dxa" w:w="100"/>
+            </w:tcMar>
+          </w:tcPr>
+          <w:p>
+            <w:pPr>
+              <w:spacing w:after="0"/>
+            </w:pPr>
+            <w:r>
+              <w:rPr>
+                <w:rFonts w:ascii="Calibri" w:cs="Calibri" w:eastAsia="Calibri" w:hAnsi="Calibri"/>
+              </w:rPr>
+              <w:t xml:space="preserve">Informativo.</w:t>
+            </w:r>
+          </w:p>
+        </w:tc>
+      </w:tr>
+      <w:tr>
+        <w:trPr>
+          <w:cantSplit/>
+        </w:trPr>
+        <w:tc>
+          <w:tcPr>
+            <w:tcW w:type="dxa" w:w="2400"/>
+            <w:shd w:fill="F2F2F2" w:color="auto" w:val="clear"/>
+            <w:tcMar>
+              <w:top w:type="dxa" w:w="60"/>
+              <w:left w:type="dxa" w:w="100"/>
+              <w:bottom w:type="dxa" w:w="60"/>
+              <w:right w:type="dxa" w:w="100"/>
+            </w:tcMar>
+          </w:tcPr>
+          <w:p>
+            <w:pPr>
+              <w:spacing w:after="0"/>
+            </w:pPr>
+            <w:r>
+              <w:rPr>
+                <w:rFonts w:ascii="Calibri" w:cs="Calibri" w:eastAsia="Calibri" w:hAnsi="Calibri"/>
+              </w:rPr>
+              <w:t xml:space="preserve">Mensagem "não se aplica / valor inválido"</w:t>
+            </w:r>
+          </w:p>
+        </w:tc>
+        <w:tc>
+          <w:tcPr>
+            <w:tcW w:type="dxa" w:w="3626"/>
+            <w:shd w:fill="F2F2F2" w:color="auto" w:val="clear"/>
+            <w:tcMar>
+              <w:top w:type="dxa" w:w="60"/>
+              <w:left w:type="dxa" w:w="100"/>
+              <w:bottom w:type="dxa" w:w="60"/>
+              <w:right w:type="dxa" w:w="100"/>
+            </w:tcMar>
+          </w:tcPr>
+          <w:p>
+            <w:pPr>
+              <w:spacing w:after="0"/>
+            </w:pPr>
+            <w:r>
+              <w:rPr>
+                <w:rFonts w:ascii="Calibri" w:cs="Calibri" w:eastAsia="Calibri" w:hAnsi="Calibri"/>
+              </w:rPr>
+              <w:t xml:space="preserve">Tentou digitar numa coluna bloqueada para o cliente ou um número negativo.</w:t>
+            </w:r>
+          </w:p>
+        </w:tc>
+        <w:tc>
+          <w:tcPr>
+            <w:tcW w:type="dxa" w:w="3000"/>
+            <w:shd w:fill="F2F2F2" w:color="auto" w:val="clear"/>
             <w:tcMar>
               <w:top w:type="dxa" w:w="60"/>
               <w:left w:type="dxa" w:w="100"/>
@@ -2121,7 +2217,7 @@
         <w:rPr>
           <w:rFonts w:ascii="Calibri" w:cs="Calibri" w:eastAsia="Calibri" w:hAnsi="Calibri"/>
         </w:rPr>
-        <w:t xml:space="preserve"> (células amarelas): uma linha por indicador, uma coluna "Todos" e uma coluna para cada cliente. O cabeçalho de cada cliente segue o cadastro da Config.</w:t>
+        <w:t xml:space="preserve">, formatada como tabela (células amarelas): uma linha por indicador, uma coluna "Todos" e uma coluna para cada cliente. O cabeçalho de cada cliente segue o cadastro da Config.</w:t>
       </w:r>
     </w:p>
     <w:p>
@@ -2386,7 +2482,7 @@
         <w:rPr>
           <w:rFonts w:ascii="Calibri" w:cs="Calibri" w:eastAsia="Calibri" w:hAnsi="Calibri"/>
         </w:rPr>
-        <w:t xml:space="preserve"> (capacidade total: 5.872 posições); com um cliente, mostra </w:t>
+        <w:t xml:space="preserve"> (capacidade total: 5.872 posições); com um cliente de contrato, mostra </w:t>
       </w:r>
       <w:r>
         <w:rPr>
@@ -2400,7 +2496,35 @@
         <w:rPr>
           <w:rFonts w:ascii="Calibri" w:cs="Calibri" w:eastAsia="Calibri" w:hAnsi="Calibri"/>
         </w:rPr>
-        <w:t xml:space="preserve">.</w:t>
+        <w:t xml:space="preserve"> (posições contratadas); com cliente Cross ou Spot, mostra </w:t>
+      </w:r>
+      <w:r>
+        <w:rPr>
+          <w:rFonts w:ascii="Calibri" w:cs="Calibri" w:eastAsia="Calibri" w:hAnsi="Calibri"/>
+          <w:b/>
+          <w:bCs/>
+        </w:rPr>
+        <w:t xml:space="preserve">CONTRATO · CROSS</w:t>
+      </w:r>
+      <w:r>
+        <w:rPr>
+          <w:rFonts w:ascii="Calibri" w:cs="Calibri" w:eastAsia="Calibri" w:hAnsi="Calibri"/>
+        </w:rPr>
+        <w:t xml:space="preserve"> ou </w:t>
+      </w:r>
+      <w:r>
+        <w:rPr>
+          <w:rFonts w:ascii="Calibri" w:cs="Calibri" w:eastAsia="Calibri" w:hAnsi="Calibri"/>
+          <w:b/>
+          <w:bCs/>
+        </w:rPr>
+        <w:t xml:space="preserve">CONTRATO · SPOT</w:t>
+      </w:r>
+      <w:r>
+        <w:rPr>
+          <w:rFonts w:ascii="Calibri" w:cs="Calibri" w:eastAsia="Calibri" w:hAnsi="Calibri"/>
+        </w:rPr>
+        <w:t xml:space="preserve"> e as posições ocupadas.</w:t>
       </w:r>
     </w:p>
     <w:p>
@@ -2889,7 +3013,7 @@
       <w:r>
         <w:drawing>
           <wp:inline distT="0" distB="0" distL="0" distR="0">
-            <wp:extent cx="5715000" cy="1781175"/>
+            <wp:extent cx="5715000" cy="1914525"/>
             <wp:effectExtent t="0" r="0" b="0" l="0"/>
             <wp:docPr id="1" name="" descr="" title=""/>
             <wp:cNvGraphicFramePr>
@@ -2914,7 +3038,7 @@
                   <pic:spPr bwMode="auto">
                     <a:xfrm>
                       <a:off x="0" y="0"/>
-                      <a:ext cx="5715000" cy="1781175"/>
+                      <a:ext cx="5715000" cy="1914525"/>
                     </a:xfrm>
                     <a:prstGeom prst="rect">
                       <a:avLst/>
@@ -3061,6 +3185,92 @@
         <w:rPr>
           <w:rFonts w:ascii="Calibri" w:cs="Calibri" w:eastAsia="Calibri" w:hAnsi="Calibri"/>
         </w:rPr>
+        <w:t xml:space="preserve">Em </w:t>
+      </w:r>
+      <w:r>
+        <w:rPr>
+          <w:rFonts w:ascii="Calibri" w:cs="Calibri" w:eastAsia="Calibri" w:hAnsi="Calibri"/>
+          <w:b/>
+          <w:bCs/>
+        </w:rPr>
+        <w:t xml:space="preserve">MODALIDADE</w:t>
+      </w:r>
+      <w:r>
+        <w:rPr>
+          <w:rFonts w:ascii="Calibri" w:cs="Calibri" w:eastAsia="Calibri" w:hAnsi="Calibri"/>
+        </w:rPr>
+        <w:t xml:space="preserve">, escolha </w:t>
+      </w:r>
+      <w:r>
+        <w:rPr>
+          <w:rFonts w:ascii="Calibri" w:cs="Calibri" w:eastAsia="Calibri" w:hAnsi="Calibri"/>
+          <w:b/>
+          <w:bCs/>
+        </w:rPr>
+        <w:t xml:space="preserve">Contrato</w:t>
+      </w:r>
+      <w:r>
+        <w:rPr>
+          <w:rFonts w:ascii="Calibri" w:cs="Calibri" w:eastAsia="Calibri" w:hAnsi="Calibri"/>
+        </w:rPr>
+        <w:t xml:space="preserve">, </w:t>
+      </w:r>
+      <w:r>
+        <w:rPr>
+          <w:rFonts w:ascii="Calibri" w:cs="Calibri" w:eastAsia="Calibri" w:hAnsi="Calibri"/>
+          <w:b/>
+          <w:bCs/>
+        </w:rPr>
+        <w:t xml:space="preserve">Spot</w:t>
+      </w:r>
+      <w:r>
+        <w:rPr>
+          <w:rFonts w:ascii="Calibri" w:cs="Calibri" w:eastAsia="Calibri" w:hAnsi="Calibri"/>
+        </w:rPr>
+        <w:t xml:space="preserve"> ou </w:t>
+      </w:r>
+      <w:r>
+        <w:rPr>
+          <w:rFonts w:ascii="Calibri" w:cs="Calibri" w:eastAsia="Calibri" w:hAnsi="Calibri"/>
+          <w:b/>
+          <w:bCs/>
+        </w:rPr>
+        <w:t xml:space="preserve">Cross</w:t>
+      </w:r>
+      <w:r>
+        <w:rPr>
+          <w:rFonts w:ascii="Calibri" w:cs="Calibri" w:eastAsia="Calibri" w:hAnsi="Calibri"/>
+        </w:rPr>
+        <w:t xml:space="preserve">. Se for Contrato, informe as </w:t>
+      </w:r>
+      <w:r>
+        <w:rPr>
+          <w:rFonts w:ascii="Calibri" w:cs="Calibri" w:eastAsia="Calibri" w:hAnsi="Calibri"/>
+          <w:b/>
+          <w:bCs/>
+        </w:rPr>
+        <w:t xml:space="preserve">POSIÇÕES CONTRATADAS</w:t>
+      </w:r>
+      <w:r>
+        <w:rPr>
+          <w:rFonts w:ascii="Calibri" w:cs="Calibri" w:eastAsia="Calibri" w:hAnsi="Calibri"/>
+        </w:rPr>
+        <w:t xml:space="preserve">. Esses dois campos alimentam as colunas Modalidade e Posições Disponíveis da BD.</w:t>
+      </w:r>
+    </w:p>
+    <w:p>
+      <w:pPr>
+        <w:pStyle w:val="ListParagraph"/>
+        <w:numPr>
+          <w:ilvl w:val="0"/>
+          <w:numId w:val="5"/>
+        </w:numPr>
+        <w:spacing w:after="80"/>
+      </w:pPr>
+      <w:r>
+        <w:rPr>
+          <w:rFonts w:ascii="Calibri" w:cs="Calibri" w:eastAsia="Calibri" w:hAnsi="Calibri"/>
+        </w:rPr>
         <w:t xml:space="preserve">Pronto: o cliente já aparece nos filtros do Dashboard e do Consol Mensal e na lista de clientes da BD.</w:t>
       </w:r>
     </w:p>
@@ -3084,7 +3294,7 @@
       <w:r>
         <w:drawing>
           <wp:inline distT="0" distB="0" distL="0" distR="0">
-            <wp:extent cx="5715000" cy="1000125"/>
+            <wp:extent cx="5715000" cy="1076325"/>
             <wp:effectExtent t="0" r="0" b="0" l="0"/>
             <wp:docPr id="1" name="" descr="" title=""/>
             <wp:cNvGraphicFramePr>
@@ -3109,7 +3319,7 @@
                   <pic:spPr bwMode="auto">
                     <a:xfrm>
                       <a:off x="0" y="0"/>
-                      <a:ext cx="5715000" cy="1000125"/>
+                      <a:ext cx="5715000" cy="1076325"/>
                     </a:xfrm>
                     <a:prstGeom prst="rect">
                       <a:avLst/>
@@ -3970,7 +4180,7 @@
               <w:rPr>
                 <w:rFonts w:ascii="Calibri" w:cs="Calibri" w:eastAsia="Calibri" w:hAnsi="Calibri"/>
               </w:rPr>
-              <w:t xml:space="preserve">Sim/Não nas colunas da BD</w:t>
+              <w:t xml:space="preserve">Modalidade e posições contratadas</w:t>
             </w:r>
           </w:p>
         </w:tc>
@@ -3993,7 +4203,7 @@
               <w:rPr>
                 <w:rFonts w:ascii="Calibri" w:cs="Calibri" w:eastAsia="Calibri" w:hAnsi="Calibri"/>
               </w:rPr>
-              <w:t xml:space="preserve">Config · tabela 2</w:t>
+              <w:t xml:space="preserve">Config · tabela 1</w:t>
             </w:r>
           </w:p>
         </w:tc>
@@ -4044,7 +4254,7 @@
               <w:rPr>
                 <w:rFonts w:ascii="Calibri" w:cs="Calibri" w:eastAsia="Calibri" w:hAnsi="Calibri"/>
               </w:rPr>
-              <w:t xml:space="preserve">Cards e gráficos</w:t>
+              <w:t xml:space="preserve">Sim/Não nas colunas da BD</w:t>
             </w:r>
           </w:p>
         </w:tc>
@@ -4067,7 +4277,7 @@
               <w:rPr>
                 <w:rFonts w:ascii="Calibri" w:cs="Calibri" w:eastAsia="Calibri" w:hAnsi="Calibri"/>
               </w:rPr>
-              <w:t xml:space="preserve">Config · tabela 1</w:t>
+              <w:t xml:space="preserve">Config · tabela 2</w:t>
             </w:r>
           </w:p>
         </w:tc>
@@ -4118,7 +4328,7 @@
               <w:rPr>
                 <w:rFonts w:ascii="Calibri" w:cs="Calibri" w:eastAsia="Calibri" w:hAnsi="Calibri"/>
               </w:rPr>
-              <w:t xml:space="preserve">Metas</w:t>
+              <w:t xml:space="preserve">Cards e gráficos</w:t>
             </w:r>
           </w:p>
         </w:tc>
@@ -4141,7 +4351,7 @@
               <w:rPr>
                 <w:rFonts w:ascii="Calibri" w:cs="Calibri" w:eastAsia="Calibri" w:hAnsi="Calibri"/>
               </w:rPr>
-              <w:t xml:space="preserve">BD · METAS DO MÊS</w:t>
+              <w:t xml:space="preserve">Config · tabela 1</w:t>
             </w:r>
           </w:p>
         </w:tc>
@@ -4192,7 +4402,7 @@
               <w:rPr>
                 <w:rFonts w:ascii="Calibri" w:cs="Calibri" w:eastAsia="Calibri" w:hAnsi="Calibri"/>
               </w:rPr>
-              <w:t xml:space="preserve">Bloco reexibido, nome digitado e linhas ajustadas</w:t>
+              <w:t xml:space="preserve">Metas</w:t>
             </w:r>
           </w:p>
         </w:tc>
@@ -4215,7 +4425,7 @@
               <w:rPr>
                 <w:rFonts w:ascii="Calibri" w:cs="Calibri" w:eastAsia="Calibri" w:hAnsi="Calibri"/>
               </w:rPr>
-              <w:t xml:space="preserve">Monitoramento</w:t>
+              <w:t xml:space="preserve">BD · METAS DO MÊS</w:t>
             </w:r>
           </w:p>
         </w:tc>
@@ -4266,7 +4476,7 @@
               <w:rPr>
                 <w:rFonts w:ascii="Calibri" w:cs="Calibri" w:eastAsia="Calibri" w:hAnsi="Calibri"/>
               </w:rPr>
-              <w:t xml:space="preserve">Abas protegidas de novo</w:t>
+              <w:t xml:space="preserve">Bloco reexibido, nome digitado e linhas ajustadas</w:t>
             </w:r>
           </w:p>
         </w:tc>
@@ -4289,7 +4499,7 @@
               <w:rPr>
                 <w:rFonts w:ascii="Calibri" w:cs="Calibri" w:eastAsia="Calibri" w:hAnsi="Calibri"/>
               </w:rPr>
-              <w:t xml:space="preserve">Config e Monitoramento</w:t>
+              <w:t xml:space="preserve">Monitoramento</w:t>
             </w:r>
           </w:p>
         </w:tc>
@@ -4297,6 +4507,80 @@
           <w:tcPr>
             <w:tcW w:type="dxa" w:w="1200"/>
             <w:shd w:fill="F2F2F2" w:color="auto" w:val="clear"/>
+            <w:tcMar>
+              <w:top w:type="dxa" w:w="60"/>
+              <w:left w:type="dxa" w:w="100"/>
+              <w:bottom w:type="dxa" w:w="60"/>
+              <w:right w:type="dxa" w:w="100"/>
+            </w:tcMar>
+          </w:tcPr>
+          <w:p>
+            <w:pPr>
+              <w:spacing w:after="0"/>
+            </w:pPr>
+            <w:r>
+              <w:rPr>
+                <w:rFonts w:ascii="Calibri" w:cs="Calibri" w:eastAsia="Calibri" w:hAnsi="Calibri"/>
+              </w:rPr>
+              <w:t xml:space="preserve">☐</w:t>
+            </w:r>
+          </w:p>
+        </w:tc>
+      </w:tr>
+      <w:tr>
+        <w:trPr>
+          <w:cantSplit/>
+        </w:trPr>
+        <w:tc>
+          <w:tcPr>
+            <w:tcW w:type="dxa" w:w="4826"/>
+            <w:shd w:fill="FFFFFF" w:color="auto" w:val="clear"/>
+            <w:tcMar>
+              <w:top w:type="dxa" w:w="60"/>
+              <w:left w:type="dxa" w:w="100"/>
+              <w:bottom w:type="dxa" w:w="60"/>
+              <w:right w:type="dxa" w:w="100"/>
+            </w:tcMar>
+          </w:tcPr>
+          <w:p>
+            <w:pPr>
+              <w:spacing w:after="0"/>
+            </w:pPr>
+            <w:r>
+              <w:rPr>
+                <w:rFonts w:ascii="Calibri" w:cs="Calibri" w:eastAsia="Calibri" w:hAnsi="Calibri"/>
+              </w:rPr>
+              <w:t xml:space="preserve">Abas protegidas de novo</w:t>
+            </w:r>
+          </w:p>
+        </w:tc>
+        <w:tc>
+          <w:tcPr>
+            <w:tcW w:type="dxa" w:w="3000"/>
+            <w:shd w:fill="FFFFFF" w:color="auto" w:val="clear"/>
+            <w:tcMar>
+              <w:top w:type="dxa" w:w="60"/>
+              <w:left w:type="dxa" w:w="100"/>
+              <w:bottom w:type="dxa" w:w="60"/>
+              <w:right w:type="dxa" w:w="100"/>
+            </w:tcMar>
+          </w:tcPr>
+          <w:p>
+            <w:pPr>
+              <w:spacing w:after="0"/>
+            </w:pPr>
+            <w:r>
+              <w:rPr>
+                <w:rFonts w:ascii="Calibri" w:cs="Calibri" w:eastAsia="Calibri" w:hAnsi="Calibri"/>
+              </w:rPr>
+              <w:t xml:space="preserve">Config e Monitoramento</w:t>
+            </w:r>
+          </w:p>
+        </w:tc>
+        <w:tc>
+          <w:tcPr>
+            <w:tcW w:type="dxa" w:w="1200"/>
+            <w:shd w:fill="FFFFFF" w:color="auto" w:val="clear"/>
             <w:tcMar>
               <w:top w:type="dxa" w:w="60"/>
               <w:left w:type="dxa" w:w="100"/>
@@ -4978,6 +5262,154 @@
               <w:rPr>
                 <w:rFonts w:ascii="Calibri" w:cs="Calibri" w:eastAsia="Calibri" w:hAnsi="Calibri"/>
               </w:rPr>
+              <w:t xml:space="preserve">MODALIDADE</w:t>
+            </w:r>
+          </w:p>
+        </w:tc>
+        <w:tc>
+          <w:tcPr>
+            <w:tcW w:type="dxa" w:w="4426"/>
+            <w:shd w:fill="FFFFFF" w:color="auto" w:val="clear"/>
+            <w:tcMar>
+              <w:top w:type="dxa" w:w="60"/>
+              <w:left w:type="dxa" w:w="100"/>
+              <w:bottom w:type="dxa" w:w="60"/>
+              <w:right w:type="dxa" w:w="100"/>
+            </w:tcMar>
+          </w:tcPr>
+          <w:p>
+            <w:pPr>
+              <w:spacing w:after="0"/>
+            </w:pPr>
+            <w:r>
+              <w:rPr>
+                <w:rFonts w:ascii="Calibri" w:cs="Calibri" w:eastAsia="Calibri" w:hAnsi="Calibri"/>
+              </w:rPr>
+              <w:t xml:space="preserve">Tipo de contrato de armazenagem. Vai para a coluna Modalidade da BD e para o card de ocupação.</w:t>
+            </w:r>
+          </w:p>
+        </w:tc>
+        <w:tc>
+          <w:tcPr>
+            <w:tcW w:type="dxa" w:w="2000"/>
+            <w:shd w:fill="FFFFFF" w:color="auto" w:val="clear"/>
+            <w:tcMar>
+              <w:top w:type="dxa" w:w="60"/>
+              <w:left w:type="dxa" w:w="100"/>
+              <w:bottom w:type="dxa" w:w="60"/>
+              <w:right w:type="dxa" w:w="100"/>
+            </w:tcMar>
+          </w:tcPr>
+          <w:p>
+            <w:pPr>
+              <w:spacing w:after="0"/>
+            </w:pPr>
+            <w:r>
+              <w:rPr>
+                <w:rFonts w:ascii="Calibri" w:cs="Calibri" w:eastAsia="Calibri" w:hAnsi="Calibri"/>
+              </w:rPr>
+              <w:t xml:space="preserve">Contrato · Spot · Cross</w:t>
+            </w:r>
+          </w:p>
+        </w:tc>
+      </w:tr>
+      <w:tr>
+        <w:trPr>
+          <w:cantSplit/>
+        </w:trPr>
+        <w:tc>
+          <w:tcPr>
+            <w:tcW w:type="dxa" w:w="2600"/>
+            <w:shd w:fill="F2F2F2" w:color="auto" w:val="clear"/>
+            <w:tcMar>
+              <w:top w:type="dxa" w:w="60"/>
+              <w:left w:type="dxa" w:w="100"/>
+              <w:bottom w:type="dxa" w:w="60"/>
+              <w:right w:type="dxa" w:w="100"/>
+            </w:tcMar>
+          </w:tcPr>
+          <w:p>
+            <w:pPr>
+              <w:spacing w:after="0"/>
+            </w:pPr>
+            <w:r>
+              <w:rPr>
+                <w:rFonts w:ascii="Calibri" w:cs="Calibri" w:eastAsia="Calibri" w:hAnsi="Calibri"/>
+              </w:rPr>
+              <w:t xml:space="preserve">POSIÇÕES CONTRATADAS</w:t>
+            </w:r>
+          </w:p>
+        </w:tc>
+        <w:tc>
+          <w:tcPr>
+            <w:tcW w:type="dxa" w:w="4426"/>
+            <w:shd w:fill="F2F2F2" w:color="auto" w:val="clear"/>
+            <w:tcMar>
+              <w:top w:type="dxa" w:w="60"/>
+              <w:left w:type="dxa" w:w="100"/>
+              <w:bottom w:type="dxa" w:w="60"/>
+              <w:right w:type="dxa" w:w="100"/>
+            </w:tcMar>
+          </w:tcPr>
+          <w:p>
+            <w:pPr>
+              <w:spacing w:after="0"/>
+            </w:pPr>
+            <w:r>
+              <w:rPr>
+                <w:rFonts w:ascii="Calibri" w:cs="Calibri" w:eastAsia="Calibri" w:hAnsi="Calibri"/>
+              </w:rPr>
+              <w:t xml:space="preserve">Só para Contrato. Vira a coluna Posições Disponíveis da BD (base da taxa de ocupação).</w:t>
+            </w:r>
+          </w:p>
+        </w:tc>
+        <w:tc>
+          <w:tcPr>
+            <w:tcW w:type="dxa" w:w="2000"/>
+            <w:shd w:fill="F2F2F2" w:color="auto" w:val="clear"/>
+            <w:tcMar>
+              <w:top w:type="dxa" w:w="60"/>
+              <w:left w:type="dxa" w:w="100"/>
+              <w:bottom w:type="dxa" w:w="60"/>
+              <w:right w:type="dxa" w:w="100"/>
+            </w:tcMar>
+          </w:tcPr>
+          <w:p>
+            <w:pPr>
+              <w:spacing w:after="0"/>
+            </w:pPr>
+            <w:r>
+              <w:rPr>
+                <w:rFonts w:ascii="Calibri" w:cs="Calibri" w:eastAsia="Calibri" w:hAnsi="Calibri"/>
+              </w:rPr>
+              <w:t xml:space="preserve">número</w:t>
+            </w:r>
+          </w:p>
+        </w:tc>
+      </w:tr>
+      <w:tr>
+        <w:trPr>
+          <w:cantSplit/>
+        </w:trPr>
+        <w:tc>
+          <w:tcPr>
+            <w:tcW w:type="dxa" w:w="2600"/>
+            <w:shd w:fill="FFFFFF" w:color="auto" w:val="clear"/>
+            <w:tcMar>
+              <w:top w:type="dxa" w:w="60"/>
+              <w:left w:type="dxa" w:w="100"/>
+              <w:bottom w:type="dxa" w:w="60"/>
+              <w:right w:type="dxa" w:w="100"/>
+            </w:tcMar>
+          </w:tcPr>
+          <w:p>
+            <w:pPr>
+              <w:spacing w:after="0"/>
+            </w:pPr>
+            <w:r>
+              <w:rPr>
+                <w:rFonts w:ascii="Calibri" w:cs="Calibri" w:eastAsia="Calibri" w:hAnsi="Calibri"/>
+              </w:rPr>
               <w:t xml:space="preserve">CARD IN · CARD OUT</w:t>
             </w:r>
           </w:p>
@@ -5450,7 +5882,7 @@
         <w:rPr>
           <w:rFonts w:ascii="Calibri" w:cs="Calibri" w:eastAsia="Calibri" w:hAnsi="Calibri"/>
         </w:rPr>
-        <w:t xml:space="preserve"> para clientes sem posições contratadas (Spot/Cross). O card mostra só OCUPADA, sem contratada, taxa e ociosidade.</w:t>
+        <w:t xml:space="preserve"> para clientes sem posições contratadas. Com MODALIDADE Spot ou Cross o card já entra nesse modo sozinho: mostra CONTRATO (CROSS/SPOT) e OCUPADA, sem taxa e ociosidade.</w:t>
       </w:r>
     </w:p>
     <w:p>
@@ -5533,7 +5965,7 @@
       <w:r>
         <w:drawing>
           <wp:inline distT="0" distB="0" distL="0" distR="0">
-            <wp:extent cx="4476750" cy="1400175"/>
+            <wp:extent cx="4476750" cy="1781175"/>
             <wp:effectExtent t="0" r="0" b="0" l="0"/>
             <wp:docPr id="1" name="" descr="" title=""/>
             <wp:cNvGraphicFramePr>
@@ -5558,7 +5990,7 @@
                   <pic:spPr bwMode="auto">
                     <a:xfrm>
                       <a:off x="0" y="0"/>
-                      <a:ext cx="4476750" cy="1400175"/>
+                      <a:ext cx="4476750" cy="1781175"/>
                     </a:xfrm>
                     <a:prstGeom prst="rect">
                       <a:avLst/>
@@ -7630,7 +8062,7 @@
               <w:rPr>
                 <w:rFonts w:ascii="Calibri" w:cs="Calibri" w:eastAsia="Calibri" w:hAnsi="Calibri"/>
               </w:rPr>
-              <w:t xml:space="preserve">Meta não aparece</w:t>
+              <w:t xml:space="preserve">Taxa de ocupação vazia ou contratada 0</w:t>
             </w:r>
           </w:p>
         </w:tc>
@@ -7653,7 +8085,7 @@
               <w:rPr>
                 <w:rFonts w:ascii="Calibri" w:cs="Calibri" w:eastAsia="Calibri" w:hAnsi="Calibri"/>
               </w:rPr>
-              <w:t xml:space="preserve">Coluna da meta vazia na BD ou nome diferente.</w:t>
+              <w:t xml:space="preserve">MODALIDADE ou POSIÇÕES CONTRATADAS do cliente não preenchidas na Config.</w:t>
             </w:r>
           </w:p>
         </w:tc>
@@ -7676,7 +8108,7 @@
               <w:rPr>
                 <w:rFonts w:ascii="Calibri" w:cs="Calibri" w:eastAsia="Calibri" w:hAnsi="Calibri"/>
               </w:rPr>
-              <w:t xml:space="preserve">Preencher a meta na coluna do cliente.</w:t>
+              <w:t xml:space="preserve">Preencher na Config › tabela 1.</w:t>
             </w:r>
           </w:p>
         </w:tc>
@@ -7704,7 +8136,7 @@
               <w:rPr>
                 <w:rFonts w:ascii="Calibri" w:cs="Calibri" w:eastAsia="Calibri" w:hAnsi="Calibri"/>
               </w:rPr>
-              <w:t xml:space="preserve">Acabaram as vagas</w:t>
+              <w:t xml:space="preserve">Meta não aparece</w:t>
             </w:r>
           </w:p>
         </w:tc>
@@ -7727,7 +8159,7 @@
               <w:rPr>
                 <w:rFonts w:ascii="Calibri" w:cs="Calibri" w:eastAsia="Calibri" w:hAnsi="Calibri"/>
               </w:rPr>
-              <w:t xml:space="preserve">20 clientes cadastrados.</w:t>
+              <w:t xml:space="preserve">Coluna da meta vazia na BD ou nome diferente.</w:t>
             </w:r>
           </w:p>
         </w:tc>
@@ -7750,7 +8182,7 @@
               <w:rPr>
                 <w:rFonts w:ascii="Calibri" w:cs="Calibri" w:eastAsia="Calibri" w:hAnsi="Calibri"/>
               </w:rPr>
-              <w:t xml:space="preserve">Reutilizar a vaga de um cliente que saiu.</w:t>
+              <w:t xml:space="preserve">Preencher a meta na coluna do cliente.</w:t>
             </w:r>
           </w:p>
         </w:tc>
@@ -7778,7 +8210,7 @@
               <w:rPr>
                 <w:rFonts w:ascii="Calibri" w:cs="Calibri" w:eastAsia="Calibri" w:hAnsi="Calibri"/>
               </w:rPr>
-              <w:t xml:space="preserve">Esqueci a senha</w:t>
+              <w:t xml:space="preserve">Acabaram as vagas</w:t>
             </w:r>
           </w:p>
         </w:tc>
@@ -7801,7 +8233,7 @@
               <w:rPr>
                 <w:rFonts w:ascii="Calibri" w:cs="Calibri" w:eastAsia="Calibri" w:hAnsi="Calibri"/>
               </w:rPr>
-              <w:t xml:space="preserve">—</w:t>
+              <w:t xml:space="preserve">20 clientes cadastrados.</w:t>
             </w:r>
           </w:p>
         </w:tc>
@@ -7809,6 +8241,80 @@
           <w:tcPr>
             <w:tcW w:type="dxa" w:w="3000"/>
             <w:shd w:fill="FFFFFF" w:color="auto" w:val="clear"/>
+            <w:tcMar>
+              <w:top w:type="dxa" w:w="60"/>
+              <w:left w:type="dxa" w:w="100"/>
+              <w:bottom w:type="dxa" w:w="60"/>
+              <w:right w:type="dxa" w:w="100"/>
+            </w:tcMar>
+          </w:tcPr>
+          <w:p>
+            <w:pPr>
+              <w:spacing w:after="0"/>
+            </w:pPr>
+            <w:r>
+              <w:rPr>
+                <w:rFonts w:ascii="Calibri" w:cs="Calibri" w:eastAsia="Calibri" w:hAnsi="Calibri"/>
+              </w:rPr>
+              <w:t xml:space="preserve">Reutilizar a vaga de um cliente que saiu.</w:t>
+            </w:r>
+          </w:p>
+        </w:tc>
+      </w:tr>
+      <w:tr>
+        <w:trPr>
+          <w:cantSplit/>
+        </w:trPr>
+        <w:tc>
+          <w:tcPr>
+            <w:tcW w:type="dxa" w:w="2700"/>
+            <w:shd w:fill="F2F2F2" w:color="auto" w:val="clear"/>
+            <w:tcMar>
+              <w:top w:type="dxa" w:w="60"/>
+              <w:left w:type="dxa" w:w="100"/>
+              <w:bottom w:type="dxa" w:w="60"/>
+              <w:right w:type="dxa" w:w="100"/>
+            </w:tcMar>
+          </w:tcPr>
+          <w:p>
+            <w:pPr>
+              <w:spacing w:after="0"/>
+            </w:pPr>
+            <w:r>
+              <w:rPr>
+                <w:rFonts w:ascii="Calibri" w:cs="Calibri" w:eastAsia="Calibri" w:hAnsi="Calibri"/>
+              </w:rPr>
+              <w:t xml:space="preserve">Esqueci a senha</w:t>
+            </w:r>
+          </w:p>
+        </w:tc>
+        <w:tc>
+          <w:tcPr>
+            <w:tcW w:type="dxa" w:w="3326"/>
+            <w:shd w:fill="F2F2F2" w:color="auto" w:val="clear"/>
+            <w:tcMar>
+              <w:top w:type="dxa" w:w="60"/>
+              <w:left w:type="dxa" w:w="100"/>
+              <w:bottom w:type="dxa" w:w="60"/>
+              <w:right w:type="dxa" w:w="100"/>
+            </w:tcMar>
+          </w:tcPr>
+          <w:p>
+            <w:pPr>
+              <w:spacing w:after="0"/>
+            </w:pPr>
+            <w:r>
+              <w:rPr>
+                <w:rFonts w:ascii="Calibri" w:cs="Calibri" w:eastAsia="Calibri" w:hAnsi="Calibri"/>
+              </w:rPr>
+              <w:t xml:space="preserve">—</w:t>
+            </w:r>
+          </w:p>
+        </w:tc>
+        <w:tc>
+          <w:tcPr>
+            <w:tcW w:type="dxa" w:w="3000"/>
+            <w:shd w:fill="F2F2F2" w:color="auto" w:val="clear"/>
             <w:tcMar>
               <w:top w:type="dxa" w:w="60"/>
               <w:left w:type="dxa" w:w="100"/>

</xml_diff>

<commit_message>
Backlog Intralog/Cliente, absenteísmo em horas, tabelas tbBaseJSL/TPC e tbMetas
- NC: Backlog vira Backlog Intralog e entra Backlog Cliente (BD, card NC,
  Monitoramento, Consol Mensal, Config e metas).
- Gente: Absenteísmo (H/H) em horas, digitado na BD e somado no período.
- BD: tabela da base renomeada para tbBaseJSL / tbBaseTPC; metas do mês
  viram tabela do Excel (tbMetasJSL / tbMetasTPC) com cabeçalho fixo
  (vagas livres = "Vaga N", renomeadas ao incluir cliente).
- Gravador xlsx aceita várias tabelas por aba.
- Modelos vazios e manuais atualizados.

Co-Authored-By: Claude Opus 5.5 <noreply@anthropic.com>
Claude-Session: https://claude.ai/code/session_018R75zNjSBiJnTTDUgbhCDy
</commit_message>
<xml_diff>
--- a/Manual_Planilha_JSL.docx
+++ b/Manual_Planilha_JSL.docx
@@ -1233,7 +1233,21 @@
         <w:rPr>
           <w:rFonts w:ascii="Calibri" w:cs="Calibri" w:eastAsia="Calibri" w:hAnsi="Calibri"/>
         </w:rPr>
-        <w:t xml:space="preserve">A BD é uma tabela do Excel: digite sempre na </w:t>
+        <w:t xml:space="preserve">A BD é uma tabela do Excel chamada </w:t>
+      </w:r>
+      <w:r>
+        <w:rPr>
+          <w:rFonts w:ascii="Calibri" w:cs="Calibri" w:eastAsia="Calibri" w:hAnsi="Calibri"/>
+          <w:b/>
+          <w:bCs/>
+        </w:rPr>
+        <w:t xml:space="preserve">tbBaseJSL</w:t>
+      </w:r>
+      <w:r>
+        <w:rPr>
+          <w:rFonts w:ascii="Calibri" w:cs="Calibri" w:eastAsia="Calibri" w:hAnsi="Calibri"/>
+        </w:rPr>
+        <w:t xml:space="preserve">: digite sempre na </w:t>
       </w:r>
       <w:r>
         <w:rPr>
@@ -1259,7 +1273,7 @@
       <w:r>
         <w:drawing>
           <wp:inline distT="0" distB="0" distL="0" distR="0">
-            <wp:extent cx="5715000" cy="2257425"/>
+            <wp:extent cx="5715000" cy="2181225"/>
             <wp:effectExtent t="0" r="0" b="0" l="0"/>
             <wp:docPr id="1" name="" descr="" title=""/>
             <wp:cNvGraphicFramePr>
@@ -1284,7 +1298,7 @@
                   <pic:spPr bwMode="auto">
                     <a:xfrm>
                       <a:off x="0" y="0"/>
-                      <a:ext cx="5715000" cy="2257425"/>
+                      <a:ext cx="5715000" cy="2181225"/>
                     </a:xfrm>
                     <a:prstGeom prst="rect">
                       <a:avLst/>
@@ -1390,6 +1404,44 @@
           <w:rFonts w:ascii="Calibri" w:cs="Calibri" w:eastAsia="Calibri" w:hAnsi="Calibri"/>
         </w:rPr>
         <w:t xml:space="preserve">; toneladas aceitam casas decimais.</w:t>
+      </w:r>
+    </w:p>
+    <w:p>
+      <w:pPr>
+        <w:pStyle w:val="ListParagraph"/>
+        <w:numPr>
+          <w:ilvl w:val="0"/>
+          <w:numId w:val="4"/>
+        </w:numPr>
+        <w:spacing w:after="80"/>
+      </w:pPr>
+      <w:r>
+        <w:rPr>
+          <w:rFonts w:ascii="Calibri" w:cs="Calibri" w:eastAsia="Calibri" w:hAnsi="Calibri"/>
+          <w:b/>
+          <w:bCs/>
+        </w:rPr>
+        <w:t xml:space="preserve">Absenteísmo (H/H)</w:t>
+      </w:r>
+      <w:r>
+        <w:rPr>
+          <w:rFonts w:ascii="Calibri" w:cs="Calibri" w:eastAsia="Calibri" w:hAnsi="Calibri"/>
+        </w:rPr>
+        <w:t xml:space="preserve"> (grupo Gente): digite as </w:t>
+      </w:r>
+      <w:r>
+        <w:rPr>
+          <w:rFonts w:ascii="Calibri" w:cs="Calibri" w:eastAsia="Calibri" w:hAnsi="Calibri"/>
+          <w:b/>
+          <w:bCs/>
+        </w:rPr>
+        <w:t xml:space="preserve">horas</w:t>
+      </w:r>
+      <w:r>
+        <w:rPr>
+          <w:rFonts w:ascii="Calibri" w:cs="Calibri" w:eastAsia="Calibri" w:hAnsi="Calibri"/>
+        </w:rPr>
+        <w:t xml:space="preserve"> de ausência do dia (ex.: 8 ou 4,5).</w:t>
       </w:r>
     </w:p>
     <w:p>
@@ -2203,21 +2255,35 @@
         <w:rPr>
           <w:rFonts w:ascii="Calibri" w:cs="Calibri" w:eastAsia="Calibri" w:hAnsi="Calibri"/>
         </w:rPr>
-        <w:t xml:space="preserve">À direita da tabela da BD fica a tabela </w:t>
-      </w:r>
-      <w:r>
-        <w:rPr>
-          <w:rFonts w:ascii="Calibri" w:cs="Calibri" w:eastAsia="Calibri" w:hAnsi="Calibri"/>
-          <w:b/>
-          <w:bCs/>
-        </w:rPr>
-        <w:t xml:space="preserve">METAS DO MÊS</w:t>
-      </w:r>
-      <w:r>
-        <w:rPr>
-          <w:rFonts w:ascii="Calibri" w:cs="Calibri" w:eastAsia="Calibri" w:hAnsi="Calibri"/>
-        </w:rPr>
-        <w:t xml:space="preserve">, formatada como tabela (células amarelas): uma linha por indicador, uma coluna "Todos" e uma coluna para cada cliente. O cabeçalho de cada cliente segue o cadastro da Config.</w:t>
+        <w:t xml:space="preserve">À direita da tabela da BD fica a tabela do Excel </w:t>
+      </w:r>
+      <w:r>
+        <w:rPr>
+          <w:rFonts w:ascii="Calibri" w:cs="Calibri" w:eastAsia="Calibri" w:hAnsi="Calibri"/>
+          <w:b/>
+          <w:bCs/>
+        </w:rPr>
+        <w:t xml:space="preserve">tbMetasJSL</w:t>
+      </w:r>
+      <w:r>
+        <w:rPr>
+          <w:rFonts w:ascii="Calibri" w:cs="Calibri" w:eastAsia="Calibri" w:hAnsi="Calibri"/>
+        </w:rPr>
+        <w:t xml:space="preserve"> (METAS DO MÊS, células amarelas): uma linha por indicador, uma coluna "Todos" e uma coluna para cada cliente. As vagas livres aparecem como </w:t>
+      </w:r>
+      <w:r>
+        <w:rPr>
+          <w:rFonts w:ascii="Calibri" w:cs="Calibri" w:eastAsia="Calibri" w:hAnsi="Calibri"/>
+          <w:b/>
+          <w:bCs/>
+        </w:rPr>
+        <w:t xml:space="preserve">Vaga 6, Vaga 7…</w:t>
+      </w:r>
+      <w:r>
+        <w:rPr>
+          <w:rFonts w:ascii="Calibri" w:cs="Calibri" w:eastAsia="Calibri" w:hAnsi="Calibri"/>
+        </w:rPr>
+        <w:t xml:space="preserve"> — ao incluir um cliente, renomeie o cabeçalho da vaga com o nome dele.</w:t>
       </w:r>
     </w:p>
     <w:p>
@@ -2559,6 +2625,92 @@
     </w:p>
     <w:p>
       <w:pPr>
+        <w:pStyle w:val="ListParagraph"/>
+        <w:numPr>
+          <w:ilvl w:val="0"/>
+          <w:numId w:val="2"/>
+        </w:numPr>
+        <w:spacing w:after="60"/>
+      </w:pPr>
+      <w:r>
+        <w:rPr>
+          <w:rFonts w:ascii="Calibri" w:cs="Calibri" w:eastAsia="Calibri" w:hAnsi="Calibri"/>
+        </w:rPr>
+        <w:t xml:space="preserve">No card </w:t>
+      </w:r>
+      <w:r>
+        <w:rPr>
+          <w:rFonts w:ascii="Calibri" w:cs="Calibri" w:eastAsia="Calibri" w:hAnsi="Calibri"/>
+          <w:b/>
+          <w:bCs/>
+        </w:rPr>
+        <w:t xml:space="preserve">NC OPERACIONAL</w:t>
+      </w:r>
+      <w:r>
+        <w:rPr>
+          <w:rFonts w:ascii="Calibri" w:cs="Calibri" w:eastAsia="Calibri" w:hAnsi="Calibri"/>
+        </w:rPr>
+        <w:t xml:space="preserve">: incidentes no período, NO SHOW, </w:t>
+      </w:r>
+      <w:r>
+        <w:rPr>
+          <w:rFonts w:ascii="Calibri" w:cs="Calibri" w:eastAsia="Calibri" w:hAnsi="Calibri"/>
+          <w:b/>
+          <w:bCs/>
+        </w:rPr>
+        <w:t xml:space="preserve">BACKLOG INTRALOG</w:t>
+      </w:r>
+      <w:r>
+        <w:rPr>
+          <w:rFonts w:ascii="Calibri" w:cs="Calibri" w:eastAsia="Calibri" w:hAnsi="Calibri"/>
+        </w:rPr>
+        <w:t xml:space="preserve"> e </w:t>
+      </w:r>
+      <w:r>
+        <w:rPr>
+          <w:rFonts w:ascii="Calibri" w:cs="Calibri" w:eastAsia="Calibri" w:hAnsi="Calibri"/>
+          <w:b/>
+          <w:bCs/>
+        </w:rPr>
+        <w:t xml:space="preserve">BACKLOG CLIENTE</w:t>
+      </w:r>
+      <w:r>
+        <w:rPr>
+          <w:rFonts w:ascii="Calibri" w:cs="Calibri" w:eastAsia="Calibri" w:hAnsi="Calibri"/>
+        </w:rPr>
+        <w:t xml:space="preserve"> (último valor do período). No card </w:t>
+      </w:r>
+      <w:r>
+        <w:rPr>
+          <w:rFonts w:ascii="Calibri" w:cs="Calibri" w:eastAsia="Calibri" w:hAnsi="Calibri"/>
+          <w:b/>
+          <w:bCs/>
+        </w:rPr>
+        <w:t xml:space="preserve">GENTE</w:t>
+      </w:r>
+      <w:r>
+        <w:rPr>
+          <w:rFonts w:ascii="Calibri" w:cs="Calibri" w:eastAsia="Calibri" w:hAnsi="Calibri"/>
+        </w:rPr>
+        <w:t xml:space="preserve">, o </w:t>
+      </w:r>
+      <w:r>
+        <w:rPr>
+          <w:rFonts w:ascii="Calibri" w:cs="Calibri" w:eastAsia="Calibri" w:hAnsi="Calibri"/>
+          <w:b/>
+          <w:bCs/>
+        </w:rPr>
+        <w:t xml:space="preserve">ABSENTEÍSMO (H/H)</w:t>
+      </w:r>
+      <w:r>
+        <w:rPr>
+          <w:rFonts w:ascii="Calibri" w:cs="Calibri" w:eastAsia="Calibri" w:hAnsi="Calibri"/>
+        </w:rPr>
+        <w:t xml:space="preserve"> é a soma das horas lançadas na BD no período.</w:t>
+      </w:r>
+    </w:p>
+    <w:p>
+      <w:pPr>
         <w:pStyle w:val="Heading2"/>
       </w:pPr>
       <w:r>
@@ -2577,7 +2729,7 @@
       <w:r>
         <w:drawing>
           <wp:inline distT="0" distB="0" distL="0" distR="0">
-            <wp:extent cx="5715000" cy="2514600"/>
+            <wp:extent cx="5715000" cy="2724150"/>
             <wp:effectExtent t="0" r="0" b="0" l="0"/>
             <wp:docPr id="1" name="" descr="" title=""/>
             <wp:cNvGraphicFramePr>
@@ -2602,7 +2754,7 @@
                   <pic:spPr bwMode="auto">
                     <a:xfrm>
                       <a:off x="0" y="0"/>
-                      <a:ext cx="5715000" cy="2514600"/>
+                      <a:ext cx="5715000" cy="2724150"/>
                     </a:xfrm>
                     <a:prstGeom prst="rect">
                       <a:avLst/>
@@ -3606,13 +3758,27 @@
           <w:b/>
           <w:bCs/>
         </w:rPr>
-        <w:t xml:space="preserve">METAS DO MÊS</w:t>
-      </w:r>
-      <w:r>
-        <w:rPr>
-          <w:rFonts w:ascii="Calibri" w:cs="Calibri" w:eastAsia="Calibri" w:hAnsi="Calibri"/>
-        </w:rPr>
-        <w:t xml:space="preserve"> (BD), a coluna da vaga já mostra o nome do cliente. Preencha as metas que existirem.</w:t>
+        <w:t xml:space="preserve">tbMetasJSL</w:t>
+      </w:r>
+      <w:r>
+        <w:rPr>
+          <w:rFonts w:ascii="Calibri" w:cs="Calibri" w:eastAsia="Calibri" w:hAnsi="Calibri"/>
+        </w:rPr>
+        <w:t xml:space="preserve"> (BD), clique no cabeçalho da coluna da vaga (ex.: "Vaga 6"), digite o </w:t>
+      </w:r>
+      <w:r>
+        <w:rPr>
+          <w:rFonts w:ascii="Calibri" w:cs="Calibri" w:eastAsia="Calibri" w:hAnsi="Calibri"/>
+          <w:b/>
+          <w:bCs/>
+        </w:rPr>
+        <w:t xml:space="preserve">nome do cliente</w:t>
+      </w:r>
+      <w:r>
+        <w:rPr>
+          <w:rFonts w:ascii="Calibri" w:cs="Calibri" w:eastAsia="Calibri" w:hAnsi="Calibri"/>
+        </w:rPr>
+        <w:t xml:space="preserve"> exatamente como na Config e preencha as metas que existirem.</w:t>
       </w:r>
     </w:p>
     <w:p>
@@ -4402,7 +4568,7 @@
               <w:rPr>
                 <w:rFonts w:ascii="Calibri" w:cs="Calibri" w:eastAsia="Calibri" w:hAnsi="Calibri"/>
               </w:rPr>
-              <w:t xml:space="preserve">Metas</w:t>
+              <w:t xml:space="preserve">Cabeçalho "Vaga N" renomeado e metas</w:t>
             </w:r>
           </w:p>
         </w:tc>
@@ -4425,7 +4591,7 @@
               <w:rPr>
                 <w:rFonts w:ascii="Calibri" w:cs="Calibri" w:eastAsia="Calibri" w:hAnsi="Calibri"/>
               </w:rPr>
-              <w:t xml:space="preserve">BD · METAS DO MÊS</w:t>
+              <w:t xml:space="preserve">BD · tbMetas</w:t>
             </w:r>
           </w:p>
         </w:tc>
@@ -4752,7 +4918,7 @@
         <w:rPr>
           <w:rFonts w:ascii="Calibri" w:cs="Calibri" w:eastAsia="Calibri" w:hAnsi="Calibri"/>
         </w:rPr>
-        <w:t xml:space="preserve"> a coluna da vaga fica sem nome; apague as metas antigas dela antes de reutilizar a vaga.</w:t>
+        <w:t xml:space="preserve"> renomeie o cabeçalho da coluna dele para "Vaga N" (N = número da vaga) e apague as metas antigas.</w:t>
       </w:r>
     </w:p>
     <w:tbl>
@@ -6530,7 +6696,7 @@
         <w:rPr>
           <w:rFonts w:ascii="Calibri" w:cs="Calibri" w:eastAsia="Calibri" w:hAnsi="Calibri"/>
         </w:rPr>
-        <w:t xml:space="preserve"> (Incidentes, No show, Backlog), </w:t>
+        <w:t xml:space="preserve"> (Incidentes, No show, Backlog Intralog, Backlog Cliente), </w:t>
       </w:r>
       <w:r>
         <w:rPr>
@@ -6558,7 +6724,7 @@
         <w:rPr>
           <w:rFonts w:ascii="Calibri" w:cs="Calibri" w:eastAsia="Calibri" w:hAnsi="Calibri"/>
         </w:rPr>
-        <w:t xml:space="preserve"> (Efetivo, Falta, Folga, Férias, Desligamento, Desvios Comportamentais, Acidentes CAF e SAF), salvo indicação.</w:t>
+        <w:t xml:space="preserve"> (Efetivo, Falta, Absenteísmo em horas, Folga, Férias, Desligamento, Desvios Comportamentais, Acidentes CAF e SAF), salvo indicação.</w:t>
       </w:r>
     </w:p>
     <w:tbl>
@@ -8159,7 +8325,7 @@
               <w:rPr>
                 <w:rFonts w:ascii="Calibri" w:cs="Calibri" w:eastAsia="Calibri" w:hAnsi="Calibri"/>
               </w:rPr>
-              <w:t xml:space="preserve">Coluna da meta vazia na BD ou nome diferente.</w:t>
+              <w:t xml:space="preserve">Coluna da meta vazia, ou cabeçalho ainda "Vaga N" / nome diferente do cadastro.</w:t>
             </w:r>
           </w:p>
         </w:tc>
@@ -8182,7 +8348,7 @@
               <w:rPr>
                 <w:rFonts w:ascii="Calibri" w:cs="Calibri" w:eastAsia="Calibri" w:hAnsi="Calibri"/>
               </w:rPr>
-              <w:t xml:space="preserve">Preencher a meta na coluna do cliente.</w:t>
+              <w:t xml:space="preserve">Renomear o cabeçalho e preencher a meta.</w:t>
             </w:r>
           </w:p>
         </w:tc>

</xml_diff>

<commit_message>
BD protegida: títulos travados, lançamentos e metas livres
- Aba BD protegida com a senha da pasta: títulos, colunas automáticas e
  cabeçalhos das metas travados; células de lançamento (inclusive linhas
  vazias, pelo estilo da coluna) e valores das metas livres; filtro,
  classificação e largura de coluna liberados.
- tbBase já vai até a linha 5001 (aba protegida não deixa a tabela crescer).
- Instruções da BD/Config e manuais atualizados.

Co-Authored-By: Claude Opus 5.5 <noreply@anthropic.com>
Claude-Session: https://claude.ai/code/session_018R75zNjSBiJnTTDUgbhCDy
</commit_message>
<xml_diff>
--- a/Manual_Planilha_JSL.docx
+++ b/Manual_Planilha_JSL.docx
@@ -828,21 +828,45 @@
         <w:rPr>
           <w:rFonts w:ascii="Calibri" w:cs="Calibri" w:eastAsia="Calibri" w:hAnsi="Calibri"/>
         </w:rPr>
-        <w:t xml:space="preserve">Todas as abas, menos a BD, são protegidas. Mesmo protegidas, os </w:t>
-      </w:r>
-      <w:r>
-        <w:rPr>
-          <w:rFonts w:ascii="Calibri" w:cs="Calibri" w:eastAsia="Calibri" w:hAnsi="Calibri"/>
-          <w:b/>
-          <w:bCs/>
-        </w:rPr>
-        <w:t xml:space="preserve">filtros continuam livres</w:t>
+        <w:t xml:space="preserve">Todas as abas são protegidas. Mesmo protegidas, continuam </w:t>
+      </w:r>
+      <w:r>
+        <w:rPr>
+          <w:rFonts w:ascii="Calibri" w:cs="Calibri" w:eastAsia="Calibri" w:hAnsi="Calibri"/>
+          <w:b/>
+          <w:bCs/>
+        </w:rPr>
+        <w:t xml:space="preserve">livres</w:t>
       </w:r>
       <w:r>
         <w:rPr>
           <w:rFonts w:ascii="Calibri" w:cs="Calibri" w:eastAsia="Calibri" w:hAnsi="Calibri"/>
         </w:rPr>
         <w:t xml:space="preserve">:</w:t>
+      </w:r>
+    </w:p>
+    <w:p>
+      <w:pPr>
+        <w:pStyle w:val="ListParagraph"/>
+        <w:numPr>
+          <w:ilvl w:val="0"/>
+          <w:numId w:val="2"/>
+        </w:numPr>
+        <w:spacing w:after="60"/>
+      </w:pPr>
+      <w:r>
+        <w:rPr>
+          <w:rFonts w:ascii="Calibri" w:cs="Calibri" w:eastAsia="Calibri" w:hAnsi="Calibri"/>
+          <w:b/>
+          <w:bCs/>
+        </w:rPr>
+        <w:t xml:space="preserve">BD:</w:t>
+      </w:r>
+      <w:r>
+        <w:rPr>
+          <w:rFonts w:ascii="Calibri" w:cs="Calibri" w:eastAsia="Calibri" w:hAnsi="Calibri"/>
+        </w:rPr>
+        <w:t xml:space="preserve"> as células de lançamento (abaixo dos títulos) e os valores das metas. Títulos, colunas cinza e cabeçalhos das metas ficam travados. Filtro e classificação funcionam.</w:t>
       </w:r>
     </w:p>
     <w:p>
@@ -1247,21 +1271,21 @@
         <w:rPr>
           <w:rFonts w:ascii="Calibri" w:cs="Calibri" w:eastAsia="Calibri" w:hAnsi="Calibri"/>
         </w:rPr>
-        <w:t xml:space="preserve">: digite sempre na </w:t>
-      </w:r>
-      <w:r>
-        <w:rPr>
-          <w:rFonts w:ascii="Calibri" w:cs="Calibri" w:eastAsia="Calibri" w:hAnsi="Calibri"/>
-          <w:b/>
-          <w:bCs/>
-        </w:rPr>
-        <w:t xml:space="preserve">primeira linha vazia logo abaixo</w:t>
-      </w:r>
-      <w:r>
-        <w:rPr>
-          <w:rFonts w:ascii="Calibri" w:cs="Calibri" w:eastAsia="Calibri" w:hAnsi="Calibri"/>
-        </w:rPr>
-        <w:t xml:space="preserve"> da tabela. Ela cresce sozinha e leva junto formato, listas e validações.</w:t>
+        <w:t xml:space="preserve">, que já vai até a linha 5001: digite sempre na </w:t>
+      </w:r>
+      <w:r>
+        <w:rPr>
+          <w:rFonts w:ascii="Calibri" w:cs="Calibri" w:eastAsia="Calibri" w:hAnsi="Calibri"/>
+          <w:b/>
+          <w:bCs/>
+        </w:rPr>
+        <w:t xml:space="preserve">primeira linha vazia</w:t>
+      </w:r>
+      <w:r>
+        <w:rPr>
+          <w:rFonts w:ascii="Calibri" w:cs="Calibri" w:eastAsia="Calibri" w:hAnsi="Calibri"/>
+        </w:rPr>
+        <w:t xml:space="preserve"> da tabela. Formato, listas e validações já estão em todas as linhas. Os títulos são travados (aba protegida).</w:t>
       </w:r>
     </w:p>
     <w:p>
@@ -3750,7 +3774,35 @@
         <w:rPr>
           <w:rFonts w:ascii="Calibri" w:cs="Calibri" w:eastAsia="Calibri" w:hAnsi="Calibri"/>
         </w:rPr>
-        <w:t xml:space="preserve">Na tabela </w:t>
+        <w:t xml:space="preserve">Desproteja a aba </w:t>
+      </w:r>
+      <w:r>
+        <w:rPr>
+          <w:rFonts w:ascii="Calibri" w:cs="Calibri" w:eastAsia="Calibri" w:hAnsi="Calibri"/>
+          <w:b/>
+          <w:bCs/>
+        </w:rPr>
+        <w:t xml:space="preserve">BD</w:t>
+      </w:r>
+      <w:r>
+        <w:rPr>
+          <w:rFonts w:ascii="Calibri" w:cs="Calibri" w:eastAsia="Calibri" w:hAnsi="Calibri"/>
+        </w:rPr>
+        <w:t xml:space="preserve"> (senha </w:t>
+      </w:r>
+      <w:r>
+        <w:rPr>
+          <w:rFonts w:ascii="Calibri" w:cs="Calibri" w:eastAsia="Calibri" w:hAnsi="Calibri"/>
+          <w:b/>
+          <w:bCs/>
+        </w:rPr>
+        <w:t xml:space="preserve">jsl</w:t>
+      </w:r>
+      <w:r>
+        <w:rPr>
+          <w:rFonts w:ascii="Calibri" w:cs="Calibri" w:eastAsia="Calibri" w:hAnsi="Calibri"/>
+        </w:rPr>
+        <w:t xml:space="preserve">). Na tabela </w:t>
       </w:r>
       <w:r>
         <w:rPr>
@@ -3764,7 +3816,7 @@
         <w:rPr>
           <w:rFonts w:ascii="Calibri" w:cs="Calibri" w:eastAsia="Calibri" w:hAnsi="Calibri"/>
         </w:rPr>
-        <w:t xml:space="preserve"> (BD), clique no cabeçalho da coluna da vaga (ex.: "Vaga 6"), digite o </w:t>
+        <w:t xml:space="preserve">, clique no cabeçalho da coluna da vaga (ex.: "Vaga 6"), digite o </w:t>
       </w:r>
       <w:r>
         <w:rPr>
@@ -3778,7 +3830,7 @@
         <w:rPr>
           <w:rFonts w:ascii="Calibri" w:cs="Calibri" w:eastAsia="Calibri" w:hAnsi="Calibri"/>
         </w:rPr>
-        <w:t xml:space="preserve"> exatamente como na Config e preencha as metas que existirem.</w:t>
+        <w:t xml:space="preserve"> exatamente como na Config, proteja a aba de novo e preencha as metas que existirem.</w:t>
       </w:r>
     </w:p>
     <w:p>
@@ -4739,7 +4791,7 @@
               <w:rPr>
                 <w:rFonts w:ascii="Calibri" w:cs="Calibri" w:eastAsia="Calibri" w:hAnsi="Calibri"/>
               </w:rPr>
-              <w:t xml:space="preserve">Config e Monitoramento</w:t>
+              <w:t xml:space="preserve">Config, BD e Monitoramento</w:t>
             </w:r>
           </w:p>
         </w:tc>
@@ -7596,6 +7648,22 @@
           <w:rFonts w:ascii="Calibri" w:cs="Calibri" w:eastAsia="Calibri" w:hAnsi="Calibri"/>
         </w:rPr>
         <w:t xml:space="preserve">Não renomear abas nem desproteger a estrutura da pasta para reexibir as abas de cálculo.</w:t>
+      </w:r>
+    </w:p>
+    <w:p>
+      <w:pPr>
+        <w:pStyle w:val="ListParagraph"/>
+        <w:numPr>
+          <w:ilvl w:val="0"/>
+          <w:numId w:val="2"/>
+        </w:numPr>
+        <w:spacing w:after="60"/>
+      </w:pPr>
+      <w:r>
+        <w:rPr>
+          <w:rFonts w:ascii="Calibri" w:cs="Calibri" w:eastAsia="Calibri" w:hAnsi="Calibri"/>
+        </w:rPr>
+        <w:t xml:space="preserve">Não renomear os títulos da BD: as fórmulas usam esses nomes e posições (por isso a aba é protegida).</w:t>
       </w:r>
     </w:p>
     <w:p>

</xml_diff>